<commit_message>
Document live StrideGrid deployment
</commit_message>
<xml_diff>
--- a/reports/StrideGrid_Capstone_Project_Report.docx
+++ b/reports/StrideGrid_Capstone_Project_Report.docx
@@ -360,7 +360,7 @@
           <w:b w:val="1"/>
           <w:rtl w:val="0"/>
         </w:rPr>
-        <w:t>18 October 2026</w:t>
+        <w:t>20 October 2026</w:t>
       </w:r>
       <w:r>
         <w:rPr>
@@ -486,7 +486,7 @@
           <w:rFonts w:ascii="Roboto Condensed" w:cs="Roboto Condensed" w:eastAsia="Roboto Condensed" w:hAnsi="Roboto Condensed"/>
           <w:rtl w:val="0"/>
         </w:rPr>
-        <w:t>The current application includes account registration and sign-in, a signed-in dashboard, a public map, foreground GPS tracking, server-side route validation, territory rules, run history, live activity updates, and responsive views. Five automated rule tests and the React production build pass. This report describes the implemented version; public hosting, a public repository URL, and a complete outdoor GPS trial remain to be completed before final submission.</w:t>
+        <w:t>The current application includes account registration and sign-in, a signed-in dashboard, a public map, foreground GPS tracking, server-side route validation, territory rules, run history, live activity updates, and responsive views. Five automated rule tests and the React production build pass. The source repository is public and the application is hosted over HTTPS with MongoDB Atlas. A complete outdoor GPS trial and the two-runner territory flow still require verification before final submission.</w:t>
       </w:r>
       <w:r>
         <w:rPr>
@@ -843,7 +843,7 @@
           <w:rFonts w:ascii="Roboto Condensed" w:cs="Roboto Condensed" w:eastAsia="Roboto Condensed" w:hAnsi="Roboto Condensed"/>
           <w:rtl w:val="0"/>
         </w:rPr>
-        <w:t>Verify core rules with tests, build the client for production, and document privacy limits and work still needed for deployment.</w:t>
+        <w:t>Verify core rules with tests, build the client for production, deploy the MERN application, and document privacy limits and the outdoor verification still required.</w:t>
       </w:r>
       <w:r>
         <w:rPr>
@@ -963,7 +963,7 @@
           <w:rFonts w:ascii="Roboto Condensed" w:cs="Roboto Condensed" w:eastAsia="Roboto Condensed" w:hAnsi="Roboto Condensed"/>
           <w:rtl w:val="0"/>
         </w:rPr>
-        <w:t>Native background tracking, teams, badges, notifications, verified anti-spoofing, and large-scale geographic querying are outside this version. A hosted HTTPS deployment and public GitHub link are also pending and must be added before the course submission.</w:t>
+        <w:t>Native background tracking, teams, badges, notifications, verified anti-spoofing, and large-scale geographic querying are outside this version. The HTTPS application and public GitHub repository are available; outdoor gameplay verification remains pending.</w:t>
       </w:r>
       <w:r>
         <w:rPr>
@@ -1378,7 +1378,7 @@
           <w:rFonts w:ascii="Roboto Condensed" w:cs="Roboto Condensed" w:eastAsia="Roboto Condensed" w:hAnsi="Roboto Condensed"/>
           <w:rtl w:val="0"/>
         </w:rPr>
-        <w:t>The first playable version is implemented locally. A new user can register, sign in, reach a private dashboard, open the territory map, and start a foreground GPS session. The API can validate a submitted run and apply the territory rules. Public visitors can view the overview, map, and leaderboard without seeing another runner’s precise route.</w:t>
+        <w:t>The first playable version is implemented locally and hosted over HTTPS. A new user can register, sign in, reach a private dashboard, open the territory map, and start a foreground GPS session. The API can validate a submitted run and apply the territory rules. Public visitors can view the overview, map, and leaderboard without seeing another runner’s precise route.</w:t>
       </w:r>
       <w:r>
         <w:rPr>
@@ -1416,7 +1416,7 @@
           <w:rFonts w:ascii="Roboto Condensed" w:cs="Roboto Condensed" w:eastAsia="Roboto Condensed" w:hAnsi="Roboto Condensed"/>
           <w:rtl w:val="0"/>
         </w:rPr>
-        <w:t>Verification on 18 October 2026: all five automated tests passed. They cover cell conversion, sampled route coverage without filling gaps, plausible and implausible GPS data, and claim/challenge/defense/capture transitions. The Vite production build also completed successfully. Local browser and API checks exercised registration, duplicate email handling, invalid and valid sign-in, session restoration, protected routes, and sign-out.</w:t>
+        <w:t>Verification on 18 October 2026: all five automated tests passed. They cover cell conversion, sampled route coverage without filling gaps, plausible and implausible GPS data, and claim/challenge/defense/capture transitions. The Vite production build also completed successfully. Local browser and API checks exercised registration, duplicate email handling, invalid and valid sign-in, session restoration, protected routes, and sign-out. On 20 October 2026, the hosted landing page, health endpoint, and public leaderboard endpoint responded successfully. Hosted account and outdoor-run flows still need testing.</w:t>
       </w:r>
       <w:r>
         <w:rPr>
@@ -1448,7 +1448,7 @@
           <w:rFonts w:ascii="Roboto Condensed" w:cs="Roboto Condensed" w:eastAsia="Roboto Condensed" w:hAnsi="Roboto Condensed"/>
           <w:rtl w:val="0"/>
         </w:rPr>
-        <w:t>The screenshots in the Appendix document the real local interface. The dashboard, leaderboard, and My Runs screenshots use a disposable demo account and show empty states because no qualifying outdoor run was submitted. They are evidence of the interface and its empty-state handling, not evidence of a completed outdoor run or successful deployment.</w:t>
+        <w:t>The screenshots in the Appendix document the real local interface. The dashboard, leaderboard, and My Runs screenshots use a disposable demo account and show empty states because no qualifying outdoor run was submitted. They are evidence of the interface and its empty-state handling, not evidence of a completed outdoor run.</w:t>
       </w:r>
       <w:r>
         <w:rPr>
@@ -1576,7 +1576,7 @@
           <w:rFonts w:ascii="Roboto Condensed" w:cs="Roboto Condensed" w:eastAsia="Roboto Condensed" w:hAnsi="Roboto Condensed"/>
           <w:rtl w:val="0"/>
         </w:rPr>
-        <w:t>Before final submission, the application should be deployed over HTTPS with a production MongoDB connection and a public repository. A real phone-based outdoor run and a two-runner challenge/defense scenario should then be verified on the hosted site. For a larger launch, territory scoring should be transactional and the public map should query by area instead of returning a fixed capped set.</w:t>
+        <w:t>The application is deployed over HTTPS with a MongoDB Atlas connection, and the source repository is public. Before final submission, a real phone-based outdoor run and a two-runner challenge/defense scenario should be verified on the hosted site. For a larger launch, territory scoring should be transactional and the public map should query by area instead of returning a fixed capped set.</w:t>
       </w:r>
       <w:r>
         <w:rPr>
@@ -1705,7 +1705,7 @@
           <w:rFonts w:ascii="Roboto Condensed" w:cs="Roboto Condensed" w:eastAsia="Roboto Condensed" w:hAnsi="Roboto Condensed"/>
           <w:rtl w:val="0"/>
         </w:rPr>
-        <w:t>Submission links to add after deployment: GitHub repository [add public URL]; hosted application [add HTTPS URL]. The screenshots below were captured from the local application on 18 October 2026. They do not include a live run result because an outdoor qualifying run has not yet been completed.</w:t>
+        <w:t>Submission links: GitHub repository https://github.com/anugrahks19/StrideGrid; hosted application https://stridegrid.onrender.com/. The screenshots below were captured from the local application on 18 October 2026. They do not include a live run result because an outdoor qualifying run has not yet been completed.</w:t>
       </w:r>
       <w:r>
         <w:rPr>

</xml_diff>

<commit_message>
Update SRS and report dates to 20 October
</commit_message>
<xml_diff>
--- a/reports/StrideGrid_Capstone_Project_Report.docx
+++ b/reports/StrideGrid_Capstone_Project_Report.docx
@@ -1416,7 +1416,7 @@
           <w:rFonts w:ascii="Roboto Condensed" w:cs="Roboto Condensed" w:eastAsia="Roboto Condensed" w:hAnsi="Roboto Condensed"/>
           <w:rtl w:val="0"/>
         </w:rPr>
-        <w:t>Verification on 18 October 2026: all five automated tests passed. They cover cell conversion, sampled route coverage without filling gaps, plausible and implausible GPS data, and claim/challenge/defense/capture transitions. The Vite production build also completed successfully. Local browser and API checks exercised registration, duplicate email handling, invalid and valid sign-in, session restoration, protected routes, and sign-out. On 20 October 2026, the hosted landing page, health endpoint, and public leaderboard endpoint responded successfully. Hosted account and outdoor-run flows still need testing.</w:t>
+        <w:t>Verification status on 20 October 2026: all five automated tests passed. They cover cell conversion, sampled route coverage without filling gaps, plausible and implausible GPS data, and claim/challenge/defense/capture transitions. The Vite production build also completed successfully. Local browser and API checks exercised registration, duplicate email handling, invalid and valid sign-in, session restoration, protected routes, and sign-out. On 20 October 2026, the hosted landing page, health endpoint, and public leaderboard endpoint responded successfully. Hosted account and outdoor-run flows still need testing.</w:t>
       </w:r>
       <w:r>
         <w:rPr>
@@ -1705,7 +1705,7 @@
           <w:rFonts w:ascii="Roboto Condensed" w:cs="Roboto Condensed" w:eastAsia="Roboto Condensed" w:hAnsi="Roboto Condensed"/>
           <w:rtl w:val="0"/>
         </w:rPr>
-        <w:t>Submission links: GitHub repository https://github.com/anugrahks19/StrideGrid; hosted application https://stridegrid.onrender.com/. The screenshots below were captured from the local application on 18 October 2026. They do not include a live run result because an outdoor qualifying run has not yet been completed.</w:t>
+        <w:t>Submission links: GitHub repository https://github.com/anugrahks19/StrideGrid; hosted application https://stridegrid.onrender.com/. The screenshots below show the local application. They do not include a live run result because an outdoor qualifying run has not yet been completed.</w:t>
       </w:r>
       <w:r>
         <w:rPr>

</xml_diff>